<commit_message>
Run all nine acceptance scenarios and refresh verification evidence
- Add the nine checks.md scenarios as a Postman v2.1 collection (Apifox and
  newman compatible), generated by scripts/build-acceptance-scenarios.py,
  with signed HR/OA requests built in pre-request scripts
- Record a full run: 42 requests, 56 assertions, 0 failures, including
  403/401/409 reverse cases; the stored report keeps no tokens or secrets
- Note a one-off VerifyError on the first login after startup
- Regenerate the four Word documents from a fresh mvn clean verify
  (36 tests passed, line 81.59%, branch 52.11%)

Co-Authored-By: Claude Opus 5.5 <noreply@anthropic.com>
</commit_message>
<xml_diff>
--- a/docs/phase-one/03-API设计文档.docx
+++ b/docs/phase-one/03-API设计文档.docx
@@ -1407,6 +1407,1229 @@
     </w:p>
     <w:p>
       <w:pPr>
+        <w:pStyle w:val="Heading2"/>
+      </w:pPr>
+      <w:r>
+        <w:t>10.1 九个串联场景的完整运行</w:t>
+      </w:r>
+    </w:p>
+    <w:p>
+      <w:r>
+        <w:t>checks.md 的 9 个场景已写成 apifox/phase-one-scenarios.postman_collection.json（Postman v2.1，由 scripts/build-acceptance-scenarios.py 生成），可直接导入 Apifox，也可用 newman 运行；断言脚本使用 pm 语法，两者通用。集合只含变量名，运行时提供 baseUrl、adminUser、adminPassword、hrSecret、oaSecret、workbookDir。</w:t>
+      </w:r>
+    </w:p>
+    <w:p>
+      <w:r>
+        <w:t>2026-10-21 在本机隔离实例（phase-one 配置、H2、端口 18091、三份虚构演示表）上用 newman 运行：42 个请求、56 条断言全部通过，用时约 4.5 秒。</w:t>
+      </w:r>
+    </w:p>
+    <w:tbl>
+      <w:tblPr>
+        <w:tblW w:type="auto" w:w="0"/>
+        <w:tblLayout w:type="fixed"/>
+        <w:tblLook w:firstColumn="1" w:firstRow="1" w:lastColumn="0" w:lastRow="0" w:noHBand="0" w:noVBand="1" w:val="04A0"/>
+      </w:tblPr>
+      <w:tblGrid>
+        <w:gridCol w:w="2409"/>
+        <w:gridCol w:w="2409"/>
+        <w:gridCol w:w="2409"/>
+        <w:gridCol w:w="2409"/>
+      </w:tblGrid>
+      <w:tr>
+        <w:trPr>
+          <w:cantSplit/>
+          <w:tblHeader/>
+        </w:trPr>
+        <w:tc>
+          <w:tcPr>
+            <w:tcW w:type="dxa" w:w="2409"/>
+            <w:vAlign w:val="center"/>
+            <w:tcBorders>
+              <w:top w:val="single" w:sz="4" w:color="D9D9D9"/>
+              <w:left w:val="single" w:sz="4" w:color="D9D9D9"/>
+              <w:bottom w:val="single" w:sz="4" w:color="D9D9D9"/>
+              <w:right w:val="single" w:sz="4" w:color="D9D9D9"/>
+            </w:tcBorders>
+            <w:shd w:fill="E8EEF3"/>
+            <w:tcMar>
+              <w:top w:w="80" w:type="dxa"/>
+              <w:bottom w:w="80" w:type="dxa"/>
+              <w:left w:w="80" w:type="dxa"/>
+              <w:right w:w="80" w:type="dxa"/>
+            </w:tcMar>
+          </w:tcPr>
+          <w:p>
+            <w:pPr>
+              <w:keepNext/>
+              <w:spacing w:after="40" w:line="252" w:lineRule="auto"/>
+            </w:pPr>
+            <w:r>
+              <w:rPr>
+                <w:b/>
+                <w:sz w:val="18"/>
+              </w:rPr>
+              <w:t>场景</w:t>
+            </w:r>
+          </w:p>
+        </w:tc>
+        <w:tc>
+          <w:tcPr>
+            <w:tcW w:type="dxa" w:w="2409"/>
+            <w:vAlign w:val="center"/>
+            <w:tcBorders>
+              <w:top w:val="single" w:sz="4" w:color="D9D9D9"/>
+              <w:left w:val="single" w:sz="4" w:color="D9D9D9"/>
+              <w:bottom w:val="single" w:sz="4" w:color="D9D9D9"/>
+              <w:right w:val="single" w:sz="4" w:color="D9D9D9"/>
+            </w:tcBorders>
+            <w:shd w:fill="E8EEF3"/>
+            <w:tcMar>
+              <w:top w:w="80" w:type="dxa"/>
+              <w:bottom w:w="80" w:type="dxa"/>
+              <w:left w:w="80" w:type="dxa"/>
+              <w:right w:w="80" w:type="dxa"/>
+            </w:tcMar>
+          </w:tcPr>
+          <w:p>
+            <w:pPr>
+              <w:keepNext/>
+              <w:spacing w:after="40" w:line="252" w:lineRule="auto"/>
+            </w:pPr>
+            <w:r>
+              <w:rPr>
+                <w:b/>
+                <w:sz w:val="18"/>
+              </w:rPr>
+              <w:t>请求</w:t>
+            </w:r>
+          </w:p>
+        </w:tc>
+        <w:tc>
+          <w:tcPr>
+            <w:tcW w:type="dxa" w:w="2409"/>
+            <w:vAlign w:val="center"/>
+            <w:tcBorders>
+              <w:top w:val="single" w:sz="4" w:color="D9D9D9"/>
+              <w:left w:val="single" w:sz="4" w:color="D9D9D9"/>
+              <w:bottom w:val="single" w:sz="4" w:color="D9D9D9"/>
+              <w:right w:val="single" w:sz="4" w:color="D9D9D9"/>
+            </w:tcBorders>
+            <w:shd w:fill="E8EEF3"/>
+            <w:tcMar>
+              <w:top w:w="80" w:type="dxa"/>
+              <w:bottom w:w="80" w:type="dxa"/>
+              <w:left w:w="80" w:type="dxa"/>
+              <w:right w:w="80" w:type="dxa"/>
+            </w:tcMar>
+          </w:tcPr>
+          <w:p>
+            <w:pPr>
+              <w:keepNext/>
+              <w:spacing w:after="40" w:line="252" w:lineRule="auto"/>
+            </w:pPr>
+            <w:r>
+              <w:rPr>
+                <w:b/>
+                <w:sz w:val="18"/>
+              </w:rPr>
+              <w:t>断言</w:t>
+            </w:r>
+          </w:p>
+        </w:tc>
+        <w:tc>
+          <w:tcPr>
+            <w:tcW w:type="dxa" w:w="2409"/>
+            <w:vAlign w:val="center"/>
+            <w:tcBorders>
+              <w:top w:val="single" w:sz="4" w:color="D9D9D9"/>
+              <w:left w:val="single" w:sz="4" w:color="D9D9D9"/>
+              <w:bottom w:val="single" w:sz="4" w:color="D9D9D9"/>
+              <w:right w:val="single" w:sz="4" w:color="D9D9D9"/>
+            </w:tcBorders>
+            <w:shd w:fill="E8EEF3"/>
+            <w:tcMar>
+              <w:top w:w="80" w:type="dxa"/>
+              <w:bottom w:w="80" w:type="dxa"/>
+              <w:left w:w="80" w:type="dxa"/>
+              <w:right w:w="80" w:type="dxa"/>
+            </w:tcMar>
+          </w:tcPr>
+          <w:p>
+            <w:pPr>
+              <w:keepNext/>
+              <w:spacing w:after="40" w:line="252" w:lineRule="auto"/>
+            </w:pPr>
+            <w:r>
+              <w:rPr>
+                <w:b/>
+                <w:sz w:val="18"/>
+              </w:rPr>
+              <w:t>覆盖的反向用例</w:t>
+            </w:r>
+          </w:p>
+        </w:tc>
+      </w:tr>
+      <w:tr>
+        <w:trPr>
+          <w:cantSplit/>
+        </w:trPr>
+        <w:tc>
+          <w:tcPr>
+            <w:tcW w:type="dxa" w:w="2409"/>
+            <w:vAlign w:val="center"/>
+            <w:tcBorders>
+              <w:top w:val="single" w:sz="4" w:color="D9D9D9"/>
+              <w:left w:val="single" w:sz="4" w:color="D9D9D9"/>
+              <w:bottom w:val="single" w:sz="4" w:color="D9D9D9"/>
+              <w:right w:val="single" w:sz="4" w:color="D9D9D9"/>
+            </w:tcBorders>
+            <w:shd w:fill="FFFFFF"/>
+            <w:tcMar>
+              <w:top w:w="80" w:type="dxa"/>
+              <w:bottom w:w="80" w:type="dxa"/>
+              <w:left w:w="80" w:type="dxa"/>
+              <w:right w:w="80" w:type="dxa"/>
+            </w:tcMar>
+          </w:tcPr>
+          <w:p>
+            <w:pPr>
+              <w:spacing w:after="40" w:line="252" w:lineRule="auto"/>
+            </w:pPr>
+            <w:r>
+              <w:rPr>
+                <w:b w:val="0"/>
+                <w:sz w:val="18"/>
+              </w:rPr>
+              <w:t>AUTH-01 登录与密码策略</w:t>
+            </w:r>
+          </w:p>
+        </w:tc>
+        <w:tc>
+          <w:tcPr>
+            <w:tcW w:type="dxa" w:w="2409"/>
+            <w:vAlign w:val="center"/>
+            <w:tcBorders>
+              <w:top w:val="single" w:sz="4" w:color="D9D9D9"/>
+              <w:left w:val="single" w:sz="4" w:color="D9D9D9"/>
+              <w:bottom w:val="single" w:sz="4" w:color="D9D9D9"/>
+              <w:right w:val="single" w:sz="4" w:color="D9D9D9"/>
+            </w:tcBorders>
+            <w:shd w:fill="FFFFFF"/>
+            <w:tcMar>
+              <w:top w:w="80" w:type="dxa"/>
+              <w:bottom w:w="80" w:type="dxa"/>
+              <w:left w:w="80" w:type="dxa"/>
+              <w:right w:w="80" w:type="dxa"/>
+            </w:tcMar>
+          </w:tcPr>
+          <w:p>
+            <w:pPr>
+              <w:spacing w:after="40" w:line="252" w:lineRule="auto"/>
+            </w:pPr>
+            <w:r>
+              <w:rPr>
+                <w:b w:val="0"/>
+                <w:sz w:val="18"/>
+              </w:rPr>
+              <w:t>2</w:t>
+            </w:r>
+          </w:p>
+        </w:tc>
+        <w:tc>
+          <w:tcPr>
+            <w:tcW w:type="dxa" w:w="2409"/>
+            <w:vAlign w:val="center"/>
+            <w:tcBorders>
+              <w:top w:val="single" w:sz="4" w:color="D9D9D9"/>
+              <w:left w:val="single" w:sz="4" w:color="D9D9D9"/>
+              <w:bottom w:val="single" w:sz="4" w:color="D9D9D9"/>
+              <w:right w:val="single" w:sz="4" w:color="D9D9D9"/>
+            </w:tcBorders>
+            <w:shd w:fill="FFFFFF"/>
+            <w:tcMar>
+              <w:top w:w="80" w:type="dxa"/>
+              <w:bottom w:w="80" w:type="dxa"/>
+              <w:left w:w="80" w:type="dxa"/>
+              <w:right w:w="80" w:type="dxa"/>
+            </w:tcMar>
+          </w:tcPr>
+          <w:p>
+            <w:pPr>
+              <w:spacing w:after="40" w:line="252" w:lineRule="auto"/>
+            </w:pPr>
+            <w:r>
+              <w:rPr>
+                <w:b w:val="0"/>
+                <w:sz w:val="18"/>
+              </w:rPr>
+              <w:t>4</w:t>
+            </w:r>
+          </w:p>
+        </w:tc>
+        <w:tc>
+          <w:tcPr>
+            <w:tcW w:type="dxa" w:w="2409"/>
+            <w:vAlign w:val="center"/>
+            <w:tcBorders>
+              <w:top w:val="single" w:sz="4" w:color="D9D9D9"/>
+              <w:left w:val="single" w:sz="4" w:color="D9D9D9"/>
+              <w:bottom w:val="single" w:sz="4" w:color="D9D9D9"/>
+              <w:right w:val="single" w:sz="4" w:color="D9D9D9"/>
+            </w:tcBorders>
+            <w:shd w:fill="FFFFFF"/>
+            <w:tcMar>
+              <w:top w:w="80" w:type="dxa"/>
+              <w:bottom w:w="80" w:type="dxa"/>
+              <w:left w:w="80" w:type="dxa"/>
+              <w:right w:w="80" w:type="dxa"/>
+            </w:tcMar>
+          </w:tcPr>
+          <w:p>
+            <w:pPr>
+              <w:spacing w:after="40" w:line="252" w:lineRule="auto"/>
+            </w:pPr>
+            <w:r>
+              <w:rPr>
+                <w:b w:val="0"/>
+                <w:sz w:val="18"/>
+              </w:rPr>
+              <w:t>错误密码 401</w:t>
+            </w:r>
+          </w:p>
+        </w:tc>
+      </w:tr>
+      <w:tr>
+        <w:trPr>
+          <w:cantSplit/>
+        </w:trPr>
+        <w:tc>
+          <w:tcPr>
+            <w:tcW w:type="dxa" w:w="2409"/>
+            <w:vAlign w:val="center"/>
+            <w:tcBorders>
+              <w:top w:val="single" w:sz="4" w:color="D9D9D9"/>
+              <w:left w:val="single" w:sz="4" w:color="D9D9D9"/>
+              <w:bottom w:val="single" w:sz="4" w:color="D9D9D9"/>
+              <w:right w:val="single" w:sz="4" w:color="D9D9D9"/>
+            </w:tcBorders>
+            <w:shd w:fill="FFFFFF"/>
+            <w:tcMar>
+              <w:top w:w="80" w:type="dxa"/>
+              <w:bottom w:w="80" w:type="dxa"/>
+              <w:left w:w="80" w:type="dxa"/>
+              <w:right w:w="80" w:type="dxa"/>
+            </w:tcMar>
+          </w:tcPr>
+          <w:p>
+            <w:pPr>
+              <w:spacing w:after="40" w:line="252" w:lineRule="auto"/>
+            </w:pPr>
+            <w:r>
+              <w:rPr>
+                <w:b w:val="0"/>
+                <w:sz w:val="18"/>
+              </w:rPr>
+              <w:t>RBAC-01 准备</w:t>
+            </w:r>
+          </w:p>
+        </w:tc>
+        <w:tc>
+          <w:tcPr>
+            <w:tcW w:type="dxa" w:w="2409"/>
+            <w:vAlign w:val="center"/>
+            <w:tcBorders>
+              <w:top w:val="single" w:sz="4" w:color="D9D9D9"/>
+              <w:left w:val="single" w:sz="4" w:color="D9D9D9"/>
+              <w:bottom w:val="single" w:sz="4" w:color="D9D9D9"/>
+              <w:right w:val="single" w:sz="4" w:color="D9D9D9"/>
+            </w:tcBorders>
+            <w:shd w:fill="FFFFFF"/>
+            <w:tcMar>
+              <w:top w:w="80" w:type="dxa"/>
+              <w:bottom w:w="80" w:type="dxa"/>
+              <w:left w:w="80" w:type="dxa"/>
+              <w:right w:w="80" w:type="dxa"/>
+            </w:tcMar>
+          </w:tcPr>
+          <w:p>
+            <w:pPr>
+              <w:spacing w:after="40" w:line="252" w:lineRule="auto"/>
+            </w:pPr>
+            <w:r>
+              <w:rPr>
+                <w:b w:val="0"/>
+                <w:sz w:val="18"/>
+              </w:rPr>
+              <w:t>12</w:t>
+            </w:r>
+          </w:p>
+        </w:tc>
+        <w:tc>
+          <w:tcPr>
+            <w:tcW w:type="dxa" w:w="2409"/>
+            <w:vAlign w:val="center"/>
+            <w:tcBorders>
+              <w:top w:val="single" w:sz="4" w:color="D9D9D9"/>
+              <w:left w:val="single" w:sz="4" w:color="D9D9D9"/>
+              <w:bottom w:val="single" w:sz="4" w:color="D9D9D9"/>
+              <w:right w:val="single" w:sz="4" w:color="D9D9D9"/>
+            </w:tcBorders>
+            <w:shd w:fill="FFFFFF"/>
+            <w:tcMar>
+              <w:top w:w="80" w:type="dxa"/>
+              <w:bottom w:w="80" w:type="dxa"/>
+              <w:left w:w="80" w:type="dxa"/>
+              <w:right w:w="80" w:type="dxa"/>
+            </w:tcMar>
+          </w:tcPr>
+          <w:p>
+            <w:pPr>
+              <w:spacing w:after="40" w:line="252" w:lineRule="auto"/>
+            </w:pPr>
+            <w:r>
+              <w:rPr>
+                <w:b w:val="0"/>
+                <w:sz w:val="18"/>
+              </w:rPr>
+              <w:t>14</w:t>
+            </w:r>
+          </w:p>
+        </w:tc>
+        <w:tc>
+          <w:tcPr>
+            <w:tcW w:type="dxa" w:w="2409"/>
+            <w:vAlign w:val="center"/>
+            <w:tcBorders>
+              <w:top w:val="single" w:sz="4" w:color="D9D9D9"/>
+              <w:left w:val="single" w:sz="4" w:color="D9D9D9"/>
+              <w:bottom w:val="single" w:sz="4" w:color="D9D9D9"/>
+              <w:right w:val="single" w:sz="4" w:color="D9D9D9"/>
+            </w:tcBorders>
+            <w:shd w:fill="FFFFFF"/>
+            <w:tcMar>
+              <w:top w:w="80" w:type="dxa"/>
+              <w:bottom w:w="80" w:type="dxa"/>
+              <w:left w:w="80" w:type="dxa"/>
+              <w:right w:w="80" w:type="dxa"/>
+            </w:tcMar>
+          </w:tcPr>
+          <w:p>
+            <w:pPr>
+              <w:spacing w:after="40" w:line="252" w:lineRule="auto"/>
+            </w:pPr>
+            <w:r>
+              <w:rPr>
+                <w:b w:val="0"/>
+                <w:sz w:val="18"/>
+              </w:rPr>
+              <w:t>—</w:t>
+            </w:r>
+          </w:p>
+        </w:tc>
+      </w:tr>
+      <w:tr>
+        <w:trPr>
+          <w:cantSplit/>
+        </w:trPr>
+        <w:tc>
+          <w:tcPr>
+            <w:tcW w:type="dxa" w:w="2409"/>
+            <w:vAlign w:val="center"/>
+            <w:tcBorders>
+              <w:top w:val="single" w:sz="4" w:color="D9D9D9"/>
+              <w:left w:val="single" w:sz="4" w:color="D9D9D9"/>
+              <w:bottom w:val="single" w:sz="4" w:color="D9D9D9"/>
+              <w:right w:val="single" w:sz="4" w:color="D9D9D9"/>
+            </w:tcBorders>
+            <w:shd w:fill="FFFFFF"/>
+            <w:tcMar>
+              <w:top w:w="80" w:type="dxa"/>
+              <w:bottom w:w="80" w:type="dxa"/>
+              <w:left w:w="80" w:type="dxa"/>
+              <w:right w:w="80" w:type="dxa"/>
+            </w:tcMar>
+          </w:tcPr>
+          <w:p>
+            <w:pPr>
+              <w:spacing w:after="40" w:line="252" w:lineRule="auto"/>
+            </w:pPr>
+            <w:r>
+              <w:rPr>
+                <w:b w:val="0"/>
+                <w:sz w:val="18"/>
+              </w:rPr>
+              <w:t>SCOPE-01 越权与无效令牌</w:t>
+            </w:r>
+          </w:p>
+        </w:tc>
+        <w:tc>
+          <w:tcPr>
+            <w:tcW w:type="dxa" w:w="2409"/>
+            <w:vAlign w:val="center"/>
+            <w:tcBorders>
+              <w:top w:val="single" w:sz="4" w:color="D9D9D9"/>
+              <w:left w:val="single" w:sz="4" w:color="D9D9D9"/>
+              <w:bottom w:val="single" w:sz="4" w:color="D9D9D9"/>
+              <w:right w:val="single" w:sz="4" w:color="D9D9D9"/>
+            </w:tcBorders>
+            <w:shd w:fill="FFFFFF"/>
+            <w:tcMar>
+              <w:top w:w="80" w:type="dxa"/>
+              <w:bottom w:w="80" w:type="dxa"/>
+              <w:left w:w="80" w:type="dxa"/>
+              <w:right w:w="80" w:type="dxa"/>
+            </w:tcMar>
+          </w:tcPr>
+          <w:p>
+            <w:pPr>
+              <w:spacing w:after="40" w:line="252" w:lineRule="auto"/>
+            </w:pPr>
+            <w:r>
+              <w:rPr>
+                <w:b w:val="0"/>
+                <w:sz w:val="18"/>
+              </w:rPr>
+              <w:t>4</w:t>
+            </w:r>
+          </w:p>
+        </w:tc>
+        <w:tc>
+          <w:tcPr>
+            <w:tcW w:type="dxa" w:w="2409"/>
+            <w:vAlign w:val="center"/>
+            <w:tcBorders>
+              <w:top w:val="single" w:sz="4" w:color="D9D9D9"/>
+              <w:left w:val="single" w:sz="4" w:color="D9D9D9"/>
+              <w:bottom w:val="single" w:sz="4" w:color="D9D9D9"/>
+              <w:right w:val="single" w:sz="4" w:color="D9D9D9"/>
+            </w:tcBorders>
+            <w:shd w:fill="FFFFFF"/>
+            <w:tcMar>
+              <w:top w:w="80" w:type="dxa"/>
+              <w:bottom w:w="80" w:type="dxa"/>
+              <w:left w:w="80" w:type="dxa"/>
+              <w:right w:w="80" w:type="dxa"/>
+            </w:tcMar>
+          </w:tcPr>
+          <w:p>
+            <w:pPr>
+              <w:spacing w:after="40" w:line="252" w:lineRule="auto"/>
+            </w:pPr>
+            <w:r>
+              <w:rPr>
+                <w:b w:val="0"/>
+                <w:sz w:val="18"/>
+              </w:rPr>
+              <w:t>4</w:t>
+            </w:r>
+          </w:p>
+        </w:tc>
+        <w:tc>
+          <w:tcPr>
+            <w:tcW w:type="dxa" w:w="2409"/>
+            <w:vAlign w:val="center"/>
+            <w:tcBorders>
+              <w:top w:val="single" w:sz="4" w:color="D9D9D9"/>
+              <w:left w:val="single" w:sz="4" w:color="D9D9D9"/>
+              <w:bottom w:val="single" w:sz="4" w:color="D9D9D9"/>
+              <w:right w:val="single" w:sz="4" w:color="D9D9D9"/>
+            </w:tcBorders>
+            <w:shd w:fill="FFFFFF"/>
+            <w:tcMar>
+              <w:top w:w="80" w:type="dxa"/>
+              <w:bottom w:w="80" w:type="dxa"/>
+              <w:left w:w="80" w:type="dxa"/>
+              <w:right w:w="80" w:type="dxa"/>
+            </w:tcMar>
+          </w:tcPr>
+          <w:p>
+            <w:pPr>
+              <w:spacing w:after="40" w:line="252" w:lineRule="auto"/>
+            </w:pPr>
+            <w:r>
+              <w:rPr>
+                <w:b w:val="0"/>
+                <w:sz w:val="18"/>
+              </w:rPr>
+              <w:t>普通用户管理 API 403、无令牌 401、伪造令牌 401</w:t>
+            </w:r>
+          </w:p>
+        </w:tc>
+      </w:tr>
+      <w:tr>
+        <w:trPr>
+          <w:cantSplit/>
+        </w:trPr>
+        <w:tc>
+          <w:tcPr>
+            <w:tcW w:type="dxa" w:w="2409"/>
+            <w:vAlign w:val="center"/>
+            <w:tcBorders>
+              <w:top w:val="single" w:sz="4" w:color="D9D9D9"/>
+              <w:left w:val="single" w:sz="4" w:color="D9D9D9"/>
+              <w:bottom w:val="single" w:sz="4" w:color="D9D9D9"/>
+              <w:right w:val="single" w:sz="4" w:color="D9D9D9"/>
+            </w:tcBorders>
+            <w:shd w:fill="FFFFFF"/>
+            <w:tcMar>
+              <w:top w:w="80" w:type="dxa"/>
+              <w:bottom w:w="80" w:type="dxa"/>
+              <w:left w:w="80" w:type="dxa"/>
+              <w:right w:w="80" w:type="dxa"/>
+            </w:tcMar>
+          </w:tcPr>
+          <w:p>
+            <w:pPr>
+              <w:spacing w:after="40" w:line="252" w:lineRule="auto"/>
+            </w:pPr>
+            <w:r>
+              <w:rPr>
+                <w:b w:val="0"/>
+                <w:sz w:val="18"/>
+              </w:rPr>
+              <w:t>RBAC-01 权限并集与回收</w:t>
+            </w:r>
+          </w:p>
+        </w:tc>
+        <w:tc>
+          <w:tcPr>
+            <w:tcW w:type="dxa" w:w="2409"/>
+            <w:vAlign w:val="center"/>
+            <w:tcBorders>
+              <w:top w:val="single" w:sz="4" w:color="D9D9D9"/>
+              <w:left w:val="single" w:sz="4" w:color="D9D9D9"/>
+              <w:bottom w:val="single" w:sz="4" w:color="D9D9D9"/>
+              <w:right w:val="single" w:sz="4" w:color="D9D9D9"/>
+            </w:tcBorders>
+            <w:shd w:fill="FFFFFF"/>
+            <w:tcMar>
+              <w:top w:w="80" w:type="dxa"/>
+              <w:bottom w:w="80" w:type="dxa"/>
+              <w:left w:w="80" w:type="dxa"/>
+              <w:right w:w="80" w:type="dxa"/>
+            </w:tcMar>
+          </w:tcPr>
+          <w:p>
+            <w:pPr>
+              <w:spacing w:after="40" w:line="252" w:lineRule="auto"/>
+            </w:pPr>
+            <w:r>
+              <w:rPr>
+                <w:b w:val="0"/>
+                <w:sz w:val="18"/>
+              </w:rPr>
+              <w:t>5</w:t>
+            </w:r>
+          </w:p>
+        </w:tc>
+        <w:tc>
+          <w:tcPr>
+            <w:tcW w:type="dxa" w:w="2409"/>
+            <w:vAlign w:val="center"/>
+            <w:tcBorders>
+              <w:top w:val="single" w:sz="4" w:color="D9D9D9"/>
+              <w:left w:val="single" w:sz="4" w:color="D9D9D9"/>
+              <w:bottom w:val="single" w:sz="4" w:color="D9D9D9"/>
+              <w:right w:val="single" w:sz="4" w:color="D9D9D9"/>
+            </w:tcBorders>
+            <w:shd w:fill="FFFFFF"/>
+            <w:tcMar>
+              <w:top w:w="80" w:type="dxa"/>
+              <w:bottom w:w="80" w:type="dxa"/>
+              <w:left w:w="80" w:type="dxa"/>
+              <w:right w:w="80" w:type="dxa"/>
+            </w:tcMar>
+          </w:tcPr>
+          <w:p>
+            <w:pPr>
+              <w:spacing w:after="40" w:line="252" w:lineRule="auto"/>
+            </w:pPr>
+            <w:r>
+              <w:rPr>
+                <w:b w:val="0"/>
+                <w:sz w:val="18"/>
+              </w:rPr>
+              <w:t>5</w:t>
+            </w:r>
+          </w:p>
+        </w:tc>
+        <w:tc>
+          <w:tcPr>
+            <w:tcW w:type="dxa" w:w="2409"/>
+            <w:vAlign w:val="center"/>
+            <w:tcBorders>
+              <w:top w:val="single" w:sz="4" w:color="D9D9D9"/>
+              <w:left w:val="single" w:sz="4" w:color="D9D9D9"/>
+              <w:bottom w:val="single" w:sz="4" w:color="D9D9D9"/>
+              <w:right w:val="single" w:sz="4" w:color="D9D9D9"/>
+            </w:tcBorders>
+            <w:shd w:fill="FFFFFF"/>
+            <w:tcMar>
+              <w:top w:w="80" w:type="dxa"/>
+              <w:bottom w:w="80" w:type="dxa"/>
+              <w:left w:w="80" w:type="dxa"/>
+              <w:right w:w="80" w:type="dxa"/>
+            </w:tcMar>
+          </w:tcPr>
+          <w:p>
+            <w:pPr>
+              <w:spacing w:after="40" w:line="252" w:lineRule="auto"/>
+            </w:pPr>
+            <w:r>
+              <w:rPr>
+                <w:b w:val="0"/>
+                <w:sz w:val="18"/>
+              </w:rPr>
+              <w:t>全部来源回收后同一令牌 403</w:t>
+            </w:r>
+          </w:p>
+        </w:tc>
+      </w:tr>
+      <w:tr>
+        <w:trPr>
+          <w:cantSplit/>
+        </w:trPr>
+        <w:tc>
+          <w:tcPr>
+            <w:tcW w:type="dxa" w:w="2409"/>
+            <w:vAlign w:val="center"/>
+            <w:tcBorders>
+              <w:top w:val="single" w:sz="4" w:color="D9D9D9"/>
+              <w:left w:val="single" w:sz="4" w:color="D9D9D9"/>
+              <w:bottom w:val="single" w:sz="4" w:color="D9D9D9"/>
+              <w:right w:val="single" w:sz="4" w:color="D9D9D9"/>
+            </w:tcBorders>
+            <w:shd w:fill="FFFFFF"/>
+            <w:tcMar>
+              <w:top w:w="80" w:type="dxa"/>
+              <w:bottom w:w="80" w:type="dxa"/>
+              <w:left w:w="80" w:type="dxa"/>
+              <w:right w:w="80" w:type="dxa"/>
+            </w:tcMar>
+          </w:tcPr>
+          <w:p>
+            <w:pPr>
+              <w:spacing w:after="40" w:line="252" w:lineRule="auto"/>
+            </w:pPr>
+            <w:r>
+              <w:rPr>
+                <w:b w:val="0"/>
+                <w:sz w:val="18"/>
+              </w:rPr>
+              <w:t>SESSION-01 注销</w:t>
+            </w:r>
+          </w:p>
+        </w:tc>
+        <w:tc>
+          <w:tcPr>
+            <w:tcW w:type="dxa" w:w="2409"/>
+            <w:vAlign w:val="center"/>
+            <w:tcBorders>
+              <w:top w:val="single" w:sz="4" w:color="D9D9D9"/>
+              <w:left w:val="single" w:sz="4" w:color="D9D9D9"/>
+              <w:bottom w:val="single" w:sz="4" w:color="D9D9D9"/>
+              <w:right w:val="single" w:sz="4" w:color="D9D9D9"/>
+            </w:tcBorders>
+            <w:shd w:fill="FFFFFF"/>
+            <w:tcMar>
+              <w:top w:w="80" w:type="dxa"/>
+              <w:bottom w:w="80" w:type="dxa"/>
+              <w:left w:w="80" w:type="dxa"/>
+              <w:right w:w="80" w:type="dxa"/>
+            </w:tcMar>
+          </w:tcPr>
+          <w:p>
+            <w:pPr>
+              <w:spacing w:after="40" w:line="252" w:lineRule="auto"/>
+            </w:pPr>
+            <w:r>
+              <w:rPr>
+                <w:b w:val="0"/>
+                <w:sz w:val="18"/>
+              </w:rPr>
+              <w:t>2</w:t>
+            </w:r>
+          </w:p>
+        </w:tc>
+        <w:tc>
+          <w:tcPr>
+            <w:tcW w:type="dxa" w:w="2409"/>
+            <w:vAlign w:val="center"/>
+            <w:tcBorders>
+              <w:top w:val="single" w:sz="4" w:color="D9D9D9"/>
+              <w:left w:val="single" w:sz="4" w:color="D9D9D9"/>
+              <w:bottom w:val="single" w:sz="4" w:color="D9D9D9"/>
+              <w:right w:val="single" w:sz="4" w:color="D9D9D9"/>
+            </w:tcBorders>
+            <w:shd w:fill="FFFFFF"/>
+            <w:tcMar>
+              <w:top w:w="80" w:type="dxa"/>
+              <w:bottom w:w="80" w:type="dxa"/>
+              <w:left w:w="80" w:type="dxa"/>
+              <w:right w:w="80" w:type="dxa"/>
+            </w:tcMar>
+          </w:tcPr>
+          <w:p>
+            <w:pPr>
+              <w:spacing w:after="40" w:line="252" w:lineRule="auto"/>
+            </w:pPr>
+            <w:r>
+              <w:rPr>
+                <w:b w:val="0"/>
+                <w:sz w:val="18"/>
+              </w:rPr>
+              <w:t>2</w:t>
+            </w:r>
+          </w:p>
+        </w:tc>
+        <w:tc>
+          <w:tcPr>
+            <w:tcW w:type="dxa" w:w="2409"/>
+            <w:vAlign w:val="center"/>
+            <w:tcBorders>
+              <w:top w:val="single" w:sz="4" w:color="D9D9D9"/>
+              <w:left w:val="single" w:sz="4" w:color="D9D9D9"/>
+              <w:bottom w:val="single" w:sz="4" w:color="D9D9D9"/>
+              <w:right w:val="single" w:sz="4" w:color="D9D9D9"/>
+            </w:tcBorders>
+            <w:shd w:fill="FFFFFF"/>
+            <w:tcMar>
+              <w:top w:w="80" w:type="dxa"/>
+              <w:bottom w:w="80" w:type="dxa"/>
+              <w:left w:w="80" w:type="dxa"/>
+              <w:right w:w="80" w:type="dxa"/>
+            </w:tcMar>
+          </w:tcPr>
+          <w:p>
+            <w:pPr>
+              <w:spacing w:after="40" w:line="252" w:lineRule="auto"/>
+            </w:pPr>
+            <w:r>
+              <w:rPr>
+                <w:b w:val="0"/>
+                <w:sz w:val="18"/>
+              </w:rPr>
+              <w:t>注销后旧令牌 401</w:t>
+            </w:r>
+          </w:p>
+        </w:tc>
+      </w:tr>
+      <w:tr>
+        <w:trPr>
+          <w:cantSplit/>
+        </w:trPr>
+        <w:tc>
+          <w:tcPr>
+            <w:tcW w:type="dxa" w:w="2409"/>
+            <w:vAlign w:val="center"/>
+            <w:tcBorders>
+              <w:top w:val="single" w:sz="4" w:color="D9D9D9"/>
+              <w:left w:val="single" w:sz="4" w:color="D9D9D9"/>
+              <w:bottom w:val="single" w:sz="4" w:color="D9D9D9"/>
+              <w:right w:val="single" w:sz="4" w:color="D9D9D9"/>
+            </w:tcBorders>
+            <w:shd w:fill="FFFFFF"/>
+            <w:tcMar>
+              <w:top w:w="80" w:type="dxa"/>
+              <w:bottom w:w="80" w:type="dxa"/>
+              <w:left w:w="80" w:type="dxa"/>
+              <w:right w:w="80" w:type="dxa"/>
+            </w:tcMar>
+          </w:tcPr>
+          <w:p>
+            <w:pPr>
+              <w:spacing w:after="40" w:line="252" w:lineRule="auto"/>
+            </w:pPr>
+            <w:r>
+              <w:rPr>
+                <w:b w:val="0"/>
+                <w:sz w:val="18"/>
+              </w:rPr>
+              <w:t>IMPORT-01 三表导入</w:t>
+            </w:r>
+          </w:p>
+        </w:tc>
+        <w:tc>
+          <w:tcPr>
+            <w:tcW w:type="dxa" w:w="2409"/>
+            <w:vAlign w:val="center"/>
+            <w:tcBorders>
+              <w:top w:val="single" w:sz="4" w:color="D9D9D9"/>
+              <w:left w:val="single" w:sz="4" w:color="D9D9D9"/>
+              <w:bottom w:val="single" w:sz="4" w:color="D9D9D9"/>
+              <w:right w:val="single" w:sz="4" w:color="D9D9D9"/>
+            </w:tcBorders>
+            <w:shd w:fill="FFFFFF"/>
+            <w:tcMar>
+              <w:top w:w="80" w:type="dxa"/>
+              <w:bottom w:w="80" w:type="dxa"/>
+              <w:left w:w="80" w:type="dxa"/>
+              <w:right w:w="80" w:type="dxa"/>
+            </w:tcMar>
+          </w:tcPr>
+          <w:p>
+            <w:pPr>
+              <w:spacing w:after="40" w:line="252" w:lineRule="auto"/>
+            </w:pPr>
+            <w:r>
+              <w:rPr>
+                <w:b w:val="0"/>
+                <w:sz w:val="18"/>
+              </w:rPr>
+              <w:t>6</w:t>
+            </w:r>
+          </w:p>
+        </w:tc>
+        <w:tc>
+          <w:tcPr>
+            <w:tcW w:type="dxa" w:w="2409"/>
+            <w:vAlign w:val="center"/>
+            <w:tcBorders>
+              <w:top w:val="single" w:sz="4" w:color="D9D9D9"/>
+              <w:left w:val="single" w:sz="4" w:color="D9D9D9"/>
+              <w:bottom w:val="single" w:sz="4" w:color="D9D9D9"/>
+              <w:right w:val="single" w:sz="4" w:color="D9D9D9"/>
+            </w:tcBorders>
+            <w:shd w:fill="FFFFFF"/>
+            <w:tcMar>
+              <w:top w:w="80" w:type="dxa"/>
+              <w:bottom w:w="80" w:type="dxa"/>
+              <w:left w:w="80" w:type="dxa"/>
+              <w:right w:w="80" w:type="dxa"/>
+            </w:tcMar>
+          </w:tcPr>
+          <w:p>
+            <w:pPr>
+              <w:spacing w:after="40" w:line="252" w:lineRule="auto"/>
+            </w:pPr>
+            <w:r>
+              <w:rPr>
+                <w:b w:val="0"/>
+                <w:sz w:val="18"/>
+              </w:rPr>
+              <w:t>9</w:t>
+            </w:r>
+          </w:p>
+        </w:tc>
+        <w:tc>
+          <w:tcPr>
+            <w:tcW w:type="dxa" w:w="2409"/>
+            <w:vAlign w:val="center"/>
+            <w:tcBorders>
+              <w:top w:val="single" w:sz="4" w:color="D9D9D9"/>
+              <w:left w:val="single" w:sz="4" w:color="D9D9D9"/>
+              <w:bottom w:val="single" w:sz="4" w:color="D9D9D9"/>
+              <w:right w:val="single" w:sz="4" w:color="D9D9D9"/>
+            </w:tcBorders>
+            <w:shd w:fill="FFFFFF"/>
+            <w:tcMar>
+              <w:top w:w="80" w:type="dxa"/>
+              <w:bottom w:w="80" w:type="dxa"/>
+              <w:left w:w="80" w:type="dxa"/>
+              <w:right w:w="80" w:type="dxa"/>
+            </w:tcMar>
+          </w:tcPr>
+          <w:p>
+            <w:pPr>
+              <w:spacing w:after="40" w:line="252" w:lineRule="auto"/>
+            </w:pPr>
+            <w:r>
+              <w:rPr>
+                <w:b w:val="0"/>
+                <w:sz w:val="18"/>
+              </w:rPr>
+              <w:t>重复提交 reused=true</w:t>
+            </w:r>
+          </w:p>
+        </w:tc>
+      </w:tr>
+      <w:tr>
+        <w:trPr>
+          <w:cantSplit/>
+        </w:trPr>
+        <w:tc>
+          <w:tcPr>
+            <w:tcW w:type="dxa" w:w="2409"/>
+            <w:vAlign w:val="center"/>
+            <w:tcBorders>
+              <w:top w:val="single" w:sz="4" w:color="D9D9D9"/>
+              <w:left w:val="single" w:sz="4" w:color="D9D9D9"/>
+              <w:bottom w:val="single" w:sz="4" w:color="D9D9D9"/>
+              <w:right w:val="single" w:sz="4" w:color="D9D9D9"/>
+            </w:tcBorders>
+            <w:shd w:fill="FFFFFF"/>
+            <w:tcMar>
+              <w:top w:w="80" w:type="dxa"/>
+              <w:bottom w:w="80" w:type="dxa"/>
+              <w:left w:w="80" w:type="dxa"/>
+              <w:right w:w="80" w:type="dxa"/>
+            </w:tcMar>
+          </w:tcPr>
+          <w:p>
+            <w:pPr>
+              <w:spacing w:after="40" w:line="252" w:lineRule="auto"/>
+            </w:pPr>
+            <w:r>
+              <w:rPr>
+                <w:b w:val="0"/>
+                <w:sz w:val="18"/>
+              </w:rPr>
+              <w:t>HR-01 签名事件</w:t>
+            </w:r>
+          </w:p>
+        </w:tc>
+        <w:tc>
+          <w:tcPr>
+            <w:tcW w:type="dxa" w:w="2409"/>
+            <w:vAlign w:val="center"/>
+            <w:tcBorders>
+              <w:top w:val="single" w:sz="4" w:color="D9D9D9"/>
+              <w:left w:val="single" w:sz="4" w:color="D9D9D9"/>
+              <w:bottom w:val="single" w:sz="4" w:color="D9D9D9"/>
+              <w:right w:val="single" w:sz="4" w:color="D9D9D9"/>
+            </w:tcBorders>
+            <w:shd w:fill="FFFFFF"/>
+            <w:tcMar>
+              <w:top w:w="80" w:type="dxa"/>
+              <w:bottom w:w="80" w:type="dxa"/>
+              <w:left w:w="80" w:type="dxa"/>
+              <w:right w:w="80" w:type="dxa"/>
+            </w:tcMar>
+          </w:tcPr>
+          <w:p>
+            <w:pPr>
+              <w:spacing w:after="40" w:line="252" w:lineRule="auto"/>
+            </w:pPr>
+            <w:r>
+              <w:rPr>
+                <w:b w:val="0"/>
+                <w:sz w:val="18"/>
+              </w:rPr>
+              <w:t>4</w:t>
+            </w:r>
+          </w:p>
+        </w:tc>
+        <w:tc>
+          <w:tcPr>
+            <w:tcW w:type="dxa" w:w="2409"/>
+            <w:vAlign w:val="center"/>
+            <w:tcBorders>
+              <w:top w:val="single" w:sz="4" w:color="D9D9D9"/>
+              <w:left w:val="single" w:sz="4" w:color="D9D9D9"/>
+              <w:bottom w:val="single" w:sz="4" w:color="D9D9D9"/>
+              <w:right w:val="single" w:sz="4" w:color="D9D9D9"/>
+            </w:tcBorders>
+            <w:shd w:fill="FFFFFF"/>
+            <w:tcMar>
+              <w:top w:w="80" w:type="dxa"/>
+              <w:bottom w:w="80" w:type="dxa"/>
+              <w:left w:w="80" w:type="dxa"/>
+              <w:right w:w="80" w:type="dxa"/>
+            </w:tcMar>
+          </w:tcPr>
+          <w:p>
+            <w:pPr>
+              <w:spacing w:after="40" w:line="252" w:lineRule="auto"/>
+            </w:pPr>
+            <w:r>
+              <w:rPr>
+                <w:b w:val="0"/>
+                <w:sz w:val="18"/>
+              </w:rPr>
+              <w:t>6</w:t>
+            </w:r>
+          </w:p>
+        </w:tc>
+        <w:tc>
+          <w:tcPr>
+            <w:tcW w:type="dxa" w:w="2409"/>
+            <w:vAlign w:val="center"/>
+            <w:tcBorders>
+              <w:top w:val="single" w:sz="4" w:color="D9D9D9"/>
+              <w:left w:val="single" w:sz="4" w:color="D9D9D9"/>
+              <w:bottom w:val="single" w:sz="4" w:color="D9D9D9"/>
+              <w:right w:val="single" w:sz="4" w:color="D9D9D9"/>
+            </w:tcBorders>
+            <w:shd w:fill="FFFFFF"/>
+            <w:tcMar>
+              <w:top w:w="80" w:type="dxa"/>
+              <w:bottom w:w="80" w:type="dxa"/>
+              <w:left w:w="80" w:type="dxa"/>
+              <w:right w:w="80" w:type="dxa"/>
+            </w:tcMar>
+          </w:tcPr>
+          <w:p>
+            <w:pPr>
+              <w:spacing w:after="40" w:line="252" w:lineRule="auto"/>
+            </w:pPr>
+            <w:r>
+              <w:rPr>
+                <w:b w:val="0"/>
+                <w:sz w:val="18"/>
+              </w:rPr>
+              <w:t>重发 reused=true、同编号不同内容 409、过期时间戳 403</w:t>
+            </w:r>
+          </w:p>
+        </w:tc>
+      </w:tr>
+      <w:tr>
+        <w:trPr>
+          <w:cantSplit/>
+        </w:trPr>
+        <w:tc>
+          <w:tcPr>
+            <w:tcW w:type="dxa" w:w="2409"/>
+            <w:vAlign w:val="center"/>
+            <w:tcBorders>
+              <w:top w:val="single" w:sz="4" w:color="D9D9D9"/>
+              <w:left w:val="single" w:sz="4" w:color="D9D9D9"/>
+              <w:bottom w:val="single" w:sz="4" w:color="D9D9D9"/>
+              <w:right w:val="single" w:sz="4" w:color="D9D9D9"/>
+            </w:tcBorders>
+            <w:shd w:fill="FFFFFF"/>
+            <w:tcMar>
+              <w:top w:w="80" w:type="dxa"/>
+              <w:bottom w:w="80" w:type="dxa"/>
+              <w:left w:w="80" w:type="dxa"/>
+              <w:right w:w="80" w:type="dxa"/>
+            </w:tcMar>
+          </w:tcPr>
+          <w:p>
+            <w:pPr>
+              <w:spacing w:after="40" w:line="252" w:lineRule="auto"/>
+            </w:pPr>
+            <w:r>
+              <w:rPr>
+                <w:b w:val="0"/>
+                <w:sz w:val="18"/>
+              </w:rPr>
+              <w:t>OA-01 申请与审批</w:t>
+            </w:r>
+          </w:p>
+        </w:tc>
+        <w:tc>
+          <w:tcPr>
+            <w:tcW w:type="dxa" w:w="2409"/>
+            <w:vAlign w:val="center"/>
+            <w:tcBorders>
+              <w:top w:val="single" w:sz="4" w:color="D9D9D9"/>
+              <w:left w:val="single" w:sz="4" w:color="D9D9D9"/>
+              <w:bottom w:val="single" w:sz="4" w:color="D9D9D9"/>
+              <w:right w:val="single" w:sz="4" w:color="D9D9D9"/>
+            </w:tcBorders>
+            <w:shd w:fill="FFFFFF"/>
+            <w:tcMar>
+              <w:top w:w="80" w:type="dxa"/>
+              <w:bottom w:w="80" w:type="dxa"/>
+              <w:left w:w="80" w:type="dxa"/>
+              <w:right w:w="80" w:type="dxa"/>
+            </w:tcMar>
+          </w:tcPr>
+          <w:p>
+            <w:pPr>
+              <w:spacing w:after="40" w:line="252" w:lineRule="auto"/>
+            </w:pPr>
+            <w:r>
+              <w:rPr>
+                <w:b w:val="0"/>
+                <w:sz w:val="18"/>
+              </w:rPr>
+              <w:t>7</w:t>
+            </w:r>
+          </w:p>
+        </w:tc>
+        <w:tc>
+          <w:tcPr>
+            <w:tcW w:type="dxa" w:w="2409"/>
+            <w:vAlign w:val="center"/>
+            <w:tcBorders>
+              <w:top w:val="single" w:sz="4" w:color="D9D9D9"/>
+              <w:left w:val="single" w:sz="4" w:color="D9D9D9"/>
+              <w:bottom w:val="single" w:sz="4" w:color="D9D9D9"/>
+              <w:right w:val="single" w:sz="4" w:color="D9D9D9"/>
+            </w:tcBorders>
+            <w:shd w:fill="FFFFFF"/>
+            <w:tcMar>
+              <w:top w:w="80" w:type="dxa"/>
+              <w:bottom w:w="80" w:type="dxa"/>
+              <w:left w:w="80" w:type="dxa"/>
+              <w:right w:w="80" w:type="dxa"/>
+            </w:tcMar>
+          </w:tcPr>
+          <w:p>
+            <w:pPr>
+              <w:spacing w:after="40" w:line="252" w:lineRule="auto"/>
+            </w:pPr>
+            <w:r>
+              <w:rPr>
+                <w:b w:val="0"/>
+                <w:sz w:val="18"/>
+              </w:rPr>
+              <w:t>12</w:t>
+            </w:r>
+          </w:p>
+        </w:tc>
+        <w:tc>
+          <w:tcPr>
+            <w:tcW w:type="dxa" w:w="2409"/>
+            <w:vAlign w:val="center"/>
+            <w:tcBorders>
+              <w:top w:val="single" w:sz="4" w:color="D9D9D9"/>
+              <w:left w:val="single" w:sz="4" w:color="D9D9D9"/>
+              <w:bottom w:val="single" w:sz="4" w:color="D9D9D9"/>
+              <w:right w:val="single" w:sz="4" w:color="D9D9D9"/>
+            </w:tcBorders>
+            <w:shd w:fill="FFFFFF"/>
+            <w:tcMar>
+              <w:top w:w="80" w:type="dxa"/>
+              <w:bottom w:w="80" w:type="dxa"/>
+              <w:left w:w="80" w:type="dxa"/>
+              <w:right w:w="80" w:type="dxa"/>
+            </w:tcMar>
+          </w:tcPr>
+          <w:p>
+            <w:pPr>
+              <w:spacing w:after="40" w:line="252" w:lineRule="auto"/>
+            </w:pPr>
+            <w:r>
+              <w:rPr>
+                <w:b w:val="0"/>
+                <w:sz w:val="18"/>
+              </w:rPr>
+              <w:t>错误签名 403、重复回调 reused=true</w:t>
+            </w:r>
+          </w:p>
+        </w:tc>
+      </w:tr>
+    </w:tbl>
+    <w:p>
+      <w:pPr>
+        <w:spacing w:after="0"/>
+      </w:pPr>
+    </w:p>
+    <w:p>
+      <w:r>
+        <w:t>运行明细：apifox/phase-one-scenarios-report.json（每步方法、路径、状态码与断言结果）和 apifox/phase-one-scenarios-cli.txt。报告不保存令牌、口令与签名密钥。复现命令（先运行 scripts/make-demo-workbooks.py 生成虚构表）：</w:t>
+      </w:r>
+    </w:p>
+    <w:p>
+      <w:pPr>
+        <w:spacing w:line="240" w:lineRule="auto"/>
+      </w:pPr>
+      <w:r>
+        <w:rPr>
+          <w:sz w:val="18"/>
+        </w:rPr>
+        <w:t>npx newman run docs/phase-one/apifox/phase-one-scenarios.postman_collection.json --env-var baseUrl=http://127.0.0.1:18091 --env-var adminUser=… --env-var adminPassword=… --env-var hrSecret=… --env-var oaSecret=… --env-var workbookDir=output/demo-workbooks</w:t>
+      </w:r>
+    </w:p>
+    <w:p>
+      <w:r>
+        <w:t>运行中观察到一次异常：服务启动后的第一次登录返回 500，日志为 Jackson 类 POJOPropertyBuilder 的 VerifyError；随后的请求和重新启动后的完整运行都正常。打包的 jackson-databind 3.1.5 与 Maven 仓库校验和一致，原因尚未查明，需在答辩前复现排查。</w:t>
+      </w:r>
+    </w:p>
+    <w:p>
+      <w:pPr>
         <w:pStyle w:val="Heading1"/>
       </w:pPr>
       <w:r>
@@ -2770,7 +3993,7 @@
                 <w:b w:val="0"/>
                 <w:sz w:val="18"/>
               </w:rPr>
-              <w:t>PUT</w:t>
+              <w:t>DELETE</w:t>
             </w:r>
           </w:p>
         </w:tc>
@@ -2868,7 +4091,7 @@
                 <w:b w:val="0"/>
                 <w:sz w:val="18"/>
               </w:rPr>
-              <w:t>DELETE</w:t>
+              <w:t>PUT</w:t>
             </w:r>
           </w:p>
         </w:tc>
@@ -3289,6 +4512,104 @@
                 <w:b w:val="0"/>
                 <w:sz w:val="18"/>
               </w:rPr>
+              <w:t>DELETE</w:t>
+            </w:r>
+          </w:p>
+        </w:tc>
+        <w:tc>
+          <w:tcPr>
+            <w:tcW w:type="dxa" w:w="4649"/>
+            <w:vAlign w:val="center"/>
+            <w:tcBorders>
+              <w:top w:val="single" w:sz="4" w:color="D9D9D9"/>
+              <w:left w:val="single" w:sz="4" w:color="D9D9D9"/>
+              <w:bottom w:val="single" w:sz="4" w:color="D9D9D9"/>
+              <w:right w:val="single" w:sz="4" w:color="D9D9D9"/>
+            </w:tcBorders>
+            <w:shd w:fill="FFFFFF"/>
+            <w:tcMar>
+              <w:top w:w="80" w:type="dxa"/>
+              <w:bottom w:w="80" w:type="dxa"/>
+              <w:left w:w="80" w:type="dxa"/>
+              <w:right w:w="80" w:type="dxa"/>
+            </w:tcMar>
+          </w:tcPr>
+          <w:p>
+            <w:pPr>
+              <w:spacing w:after="40" w:line="252" w:lineRule="auto"/>
+            </w:pPr>
+            <w:r>
+              <w:rPr>
+                <w:b w:val="0"/>
+                <w:sz w:val="18"/>
+              </w:rPr>
+              <w:t>/api/roles/{roleId}</w:t>
+            </w:r>
+          </w:p>
+        </w:tc>
+        <w:tc>
+          <w:tcPr>
+            <w:tcW w:type="dxa" w:w="3855"/>
+            <w:vAlign w:val="center"/>
+            <w:tcBorders>
+              <w:top w:val="single" w:sz="4" w:color="D9D9D9"/>
+              <w:left w:val="single" w:sz="4" w:color="D9D9D9"/>
+              <w:bottom w:val="single" w:sz="4" w:color="D9D9D9"/>
+              <w:right w:val="single" w:sz="4" w:color="D9D9D9"/>
+            </w:tcBorders>
+            <w:shd w:fill="FFFFFF"/>
+            <w:tcMar>
+              <w:top w:w="80" w:type="dxa"/>
+              <w:bottom w:w="80" w:type="dxa"/>
+              <w:left w:w="80" w:type="dxa"/>
+              <w:right w:w="80" w:type="dxa"/>
+            </w:tcMar>
+          </w:tcPr>
+          <w:p>
+            <w:pPr>
+              <w:spacing w:after="40" w:line="252" w:lineRule="auto"/>
+            </w:pPr>
+            <w:r>
+              <w:rPr>
+                <w:b w:val="0"/>
+                <w:sz w:val="18"/>
+              </w:rPr>
+              <w:t>无请求体或使用路径参数</w:t>
+            </w:r>
+          </w:p>
+        </w:tc>
+      </w:tr>
+      <w:tr>
+        <w:trPr>
+          <w:cantSplit/>
+        </w:trPr>
+        <w:tc>
+          <w:tcPr>
+            <w:tcW w:type="dxa" w:w="1134"/>
+            <w:vAlign w:val="center"/>
+            <w:tcBorders>
+              <w:top w:val="single" w:sz="4" w:color="D9D9D9"/>
+              <w:left w:val="single" w:sz="4" w:color="D9D9D9"/>
+              <w:bottom w:val="single" w:sz="4" w:color="D9D9D9"/>
+              <w:right w:val="single" w:sz="4" w:color="D9D9D9"/>
+            </w:tcBorders>
+            <w:shd w:fill="FFFFFF"/>
+            <w:tcMar>
+              <w:top w:w="80" w:type="dxa"/>
+              <w:bottom w:w="80" w:type="dxa"/>
+              <w:left w:w="80" w:type="dxa"/>
+              <w:right w:w="80" w:type="dxa"/>
+            </w:tcMar>
+          </w:tcPr>
+          <w:p>
+            <w:pPr>
+              <w:spacing w:after="40" w:line="252" w:lineRule="auto"/>
+            </w:pPr>
+            <w:r>
+              <w:rPr>
+                <w:b w:val="0"/>
+                <w:sz w:val="18"/>
+              </w:rPr>
               <w:t>PUT</w:t>
             </w:r>
           </w:p>
@@ -3352,104 +4673,6 @@
                 <w:sz w:val="18"/>
               </w:rPr>
               <w:t>body: name, description, enabled</w:t>
-            </w:r>
-          </w:p>
-        </w:tc>
-      </w:tr>
-      <w:tr>
-        <w:trPr>
-          <w:cantSplit/>
-        </w:trPr>
-        <w:tc>
-          <w:tcPr>
-            <w:tcW w:type="dxa" w:w="1134"/>
-            <w:vAlign w:val="center"/>
-            <w:tcBorders>
-              <w:top w:val="single" w:sz="4" w:color="D9D9D9"/>
-              <w:left w:val="single" w:sz="4" w:color="D9D9D9"/>
-              <w:bottom w:val="single" w:sz="4" w:color="D9D9D9"/>
-              <w:right w:val="single" w:sz="4" w:color="D9D9D9"/>
-            </w:tcBorders>
-            <w:shd w:fill="FFFFFF"/>
-            <w:tcMar>
-              <w:top w:w="80" w:type="dxa"/>
-              <w:bottom w:w="80" w:type="dxa"/>
-              <w:left w:w="80" w:type="dxa"/>
-              <w:right w:w="80" w:type="dxa"/>
-            </w:tcMar>
-          </w:tcPr>
-          <w:p>
-            <w:pPr>
-              <w:spacing w:after="40" w:line="252" w:lineRule="auto"/>
-            </w:pPr>
-            <w:r>
-              <w:rPr>
-                <w:b w:val="0"/>
-                <w:sz w:val="18"/>
-              </w:rPr>
-              <w:t>DELETE</w:t>
-            </w:r>
-          </w:p>
-        </w:tc>
-        <w:tc>
-          <w:tcPr>
-            <w:tcW w:type="dxa" w:w="4649"/>
-            <w:vAlign w:val="center"/>
-            <w:tcBorders>
-              <w:top w:val="single" w:sz="4" w:color="D9D9D9"/>
-              <w:left w:val="single" w:sz="4" w:color="D9D9D9"/>
-              <w:bottom w:val="single" w:sz="4" w:color="D9D9D9"/>
-              <w:right w:val="single" w:sz="4" w:color="D9D9D9"/>
-            </w:tcBorders>
-            <w:shd w:fill="FFFFFF"/>
-            <w:tcMar>
-              <w:top w:w="80" w:type="dxa"/>
-              <w:bottom w:w="80" w:type="dxa"/>
-              <w:left w:w="80" w:type="dxa"/>
-              <w:right w:w="80" w:type="dxa"/>
-            </w:tcMar>
-          </w:tcPr>
-          <w:p>
-            <w:pPr>
-              <w:spacing w:after="40" w:line="252" w:lineRule="auto"/>
-            </w:pPr>
-            <w:r>
-              <w:rPr>
-                <w:b w:val="0"/>
-                <w:sz w:val="18"/>
-              </w:rPr>
-              <w:t>/api/roles/{roleId}</w:t>
-            </w:r>
-          </w:p>
-        </w:tc>
-        <w:tc>
-          <w:tcPr>
-            <w:tcW w:type="dxa" w:w="3855"/>
-            <w:vAlign w:val="center"/>
-            <w:tcBorders>
-              <w:top w:val="single" w:sz="4" w:color="D9D9D9"/>
-              <w:left w:val="single" w:sz="4" w:color="D9D9D9"/>
-              <w:bottom w:val="single" w:sz="4" w:color="D9D9D9"/>
-              <w:right w:val="single" w:sz="4" w:color="D9D9D9"/>
-            </w:tcBorders>
-            <w:shd w:fill="FFFFFF"/>
-            <w:tcMar>
-              <w:top w:w="80" w:type="dxa"/>
-              <w:bottom w:w="80" w:type="dxa"/>
-              <w:left w:w="80" w:type="dxa"/>
-              <w:right w:w="80" w:type="dxa"/>
-            </w:tcMar>
-          </w:tcPr>
-          <w:p>
-            <w:pPr>
-              <w:spacing w:after="40" w:line="252" w:lineRule="auto"/>
-            </w:pPr>
-            <w:r>
-              <w:rPr>
-                <w:b w:val="0"/>
-                <w:sz w:val="18"/>
-              </w:rPr>
-              <w:t>无请求体或使用路径参数</w:t>
             </w:r>
           </w:p>
         </w:tc>
@@ -3583,7 +4806,7 @@
                 <w:b w:val="0"/>
                 <w:sz w:val="18"/>
               </w:rPr>
-              <w:t>PUT</w:t>
+              <w:t>DELETE</w:t>
             </w:r>
           </w:p>
         </w:tc>
@@ -3681,7 +4904,7 @@
                 <w:b w:val="0"/>
                 <w:sz w:val="18"/>
               </w:rPr>
-              <w:t>DELETE</w:t>
+              <w:t>PUT</w:t>
             </w:r>
           </w:p>
         </w:tc>
@@ -4102,6 +5325,104 @@
                 <w:b w:val="0"/>
                 <w:sz w:val="18"/>
               </w:rPr>
+              <w:t>DELETE</w:t>
+            </w:r>
+          </w:p>
+        </w:tc>
+        <w:tc>
+          <w:tcPr>
+            <w:tcW w:type="dxa" w:w="4649"/>
+            <w:vAlign w:val="center"/>
+            <w:tcBorders>
+              <w:top w:val="single" w:sz="4" w:color="D9D9D9"/>
+              <w:left w:val="single" w:sz="4" w:color="D9D9D9"/>
+              <w:bottom w:val="single" w:sz="4" w:color="D9D9D9"/>
+              <w:right w:val="single" w:sz="4" w:color="D9D9D9"/>
+            </w:tcBorders>
+            <w:shd w:fill="FFFFFF"/>
+            <w:tcMar>
+              <w:top w:w="80" w:type="dxa"/>
+              <w:bottom w:w="80" w:type="dxa"/>
+              <w:left w:w="80" w:type="dxa"/>
+              <w:right w:w="80" w:type="dxa"/>
+            </w:tcMar>
+          </w:tcPr>
+          <w:p>
+            <w:pPr>
+              <w:spacing w:after="40" w:line="252" w:lineRule="auto"/>
+            </w:pPr>
+            <w:r>
+              <w:rPr>
+                <w:b w:val="0"/>
+                <w:sz w:val="18"/>
+              </w:rPr>
+              <w:t>/api/systems/{systemId}</w:t>
+            </w:r>
+          </w:p>
+        </w:tc>
+        <w:tc>
+          <w:tcPr>
+            <w:tcW w:type="dxa" w:w="3855"/>
+            <w:vAlign w:val="center"/>
+            <w:tcBorders>
+              <w:top w:val="single" w:sz="4" w:color="D9D9D9"/>
+              <w:left w:val="single" w:sz="4" w:color="D9D9D9"/>
+              <w:bottom w:val="single" w:sz="4" w:color="D9D9D9"/>
+              <w:right w:val="single" w:sz="4" w:color="D9D9D9"/>
+            </w:tcBorders>
+            <w:shd w:fill="FFFFFF"/>
+            <w:tcMar>
+              <w:top w:w="80" w:type="dxa"/>
+              <w:bottom w:w="80" w:type="dxa"/>
+              <w:left w:w="80" w:type="dxa"/>
+              <w:right w:w="80" w:type="dxa"/>
+            </w:tcMar>
+          </w:tcPr>
+          <w:p>
+            <w:pPr>
+              <w:spacing w:after="40" w:line="252" w:lineRule="auto"/>
+            </w:pPr>
+            <w:r>
+              <w:rPr>
+                <w:b w:val="0"/>
+                <w:sz w:val="18"/>
+              </w:rPr>
+              <w:t>无请求体或使用路径参数</w:t>
+            </w:r>
+          </w:p>
+        </w:tc>
+      </w:tr>
+      <w:tr>
+        <w:trPr>
+          <w:cantSplit/>
+        </w:trPr>
+        <w:tc>
+          <w:tcPr>
+            <w:tcW w:type="dxa" w:w="1134"/>
+            <w:vAlign w:val="center"/>
+            <w:tcBorders>
+              <w:top w:val="single" w:sz="4" w:color="D9D9D9"/>
+              <w:left w:val="single" w:sz="4" w:color="D9D9D9"/>
+              <w:bottom w:val="single" w:sz="4" w:color="D9D9D9"/>
+              <w:right w:val="single" w:sz="4" w:color="D9D9D9"/>
+            </w:tcBorders>
+            <w:shd w:fill="FFFFFF"/>
+            <w:tcMar>
+              <w:top w:w="80" w:type="dxa"/>
+              <w:bottom w:w="80" w:type="dxa"/>
+              <w:left w:w="80" w:type="dxa"/>
+              <w:right w:w="80" w:type="dxa"/>
+            </w:tcMar>
+          </w:tcPr>
+          <w:p>
+            <w:pPr>
+              <w:spacing w:after="40" w:line="252" w:lineRule="auto"/>
+            </w:pPr>
+            <w:r>
+              <w:rPr>
+                <w:b w:val="0"/>
+                <w:sz w:val="18"/>
+              </w:rPr>
               <w:t>PUT</w:t>
             </w:r>
           </w:p>
@@ -4165,104 +5486,6 @@
                 <w:sz w:val="18"/>
               </w:rPr>
               <w:t>body: name, baseUrl, enabled</w:t>
-            </w:r>
-          </w:p>
-        </w:tc>
-      </w:tr>
-      <w:tr>
-        <w:trPr>
-          <w:cantSplit/>
-        </w:trPr>
-        <w:tc>
-          <w:tcPr>
-            <w:tcW w:type="dxa" w:w="1134"/>
-            <w:vAlign w:val="center"/>
-            <w:tcBorders>
-              <w:top w:val="single" w:sz="4" w:color="D9D9D9"/>
-              <w:left w:val="single" w:sz="4" w:color="D9D9D9"/>
-              <w:bottom w:val="single" w:sz="4" w:color="D9D9D9"/>
-              <w:right w:val="single" w:sz="4" w:color="D9D9D9"/>
-            </w:tcBorders>
-            <w:shd w:fill="FFFFFF"/>
-            <w:tcMar>
-              <w:top w:w="80" w:type="dxa"/>
-              <w:bottom w:w="80" w:type="dxa"/>
-              <w:left w:w="80" w:type="dxa"/>
-              <w:right w:w="80" w:type="dxa"/>
-            </w:tcMar>
-          </w:tcPr>
-          <w:p>
-            <w:pPr>
-              <w:spacing w:after="40" w:line="252" w:lineRule="auto"/>
-            </w:pPr>
-            <w:r>
-              <w:rPr>
-                <w:b w:val="0"/>
-                <w:sz w:val="18"/>
-              </w:rPr>
-              <w:t>DELETE</w:t>
-            </w:r>
-          </w:p>
-        </w:tc>
-        <w:tc>
-          <w:tcPr>
-            <w:tcW w:type="dxa" w:w="4649"/>
-            <w:vAlign w:val="center"/>
-            <w:tcBorders>
-              <w:top w:val="single" w:sz="4" w:color="D9D9D9"/>
-              <w:left w:val="single" w:sz="4" w:color="D9D9D9"/>
-              <w:bottom w:val="single" w:sz="4" w:color="D9D9D9"/>
-              <w:right w:val="single" w:sz="4" w:color="D9D9D9"/>
-            </w:tcBorders>
-            <w:shd w:fill="FFFFFF"/>
-            <w:tcMar>
-              <w:top w:w="80" w:type="dxa"/>
-              <w:bottom w:w="80" w:type="dxa"/>
-              <w:left w:w="80" w:type="dxa"/>
-              <w:right w:w="80" w:type="dxa"/>
-            </w:tcMar>
-          </w:tcPr>
-          <w:p>
-            <w:pPr>
-              <w:spacing w:after="40" w:line="252" w:lineRule="auto"/>
-            </w:pPr>
-            <w:r>
-              <w:rPr>
-                <w:b w:val="0"/>
-                <w:sz w:val="18"/>
-              </w:rPr>
-              <w:t>/api/systems/{systemId}</w:t>
-            </w:r>
-          </w:p>
-        </w:tc>
-        <w:tc>
-          <w:tcPr>
-            <w:tcW w:type="dxa" w:w="3855"/>
-            <w:vAlign w:val="center"/>
-            <w:tcBorders>
-              <w:top w:val="single" w:sz="4" w:color="D9D9D9"/>
-              <w:left w:val="single" w:sz="4" w:color="D9D9D9"/>
-              <w:bottom w:val="single" w:sz="4" w:color="D9D9D9"/>
-              <w:right w:val="single" w:sz="4" w:color="D9D9D9"/>
-            </w:tcBorders>
-            <w:shd w:fill="FFFFFF"/>
-            <w:tcMar>
-              <w:top w:w="80" w:type="dxa"/>
-              <w:bottom w:w="80" w:type="dxa"/>
-              <w:left w:w="80" w:type="dxa"/>
-              <w:right w:w="80" w:type="dxa"/>
-            </w:tcMar>
-          </w:tcPr>
-          <w:p>
-            <w:pPr>
-              <w:spacing w:after="40" w:line="252" w:lineRule="auto"/>
-            </w:pPr>
-            <w:r>
-              <w:rPr>
-                <w:b w:val="0"/>
-                <w:sz w:val="18"/>
-              </w:rPr>
-              <w:t>无请求体或使用路径参数</w:t>
             </w:r>
           </w:p>
         </w:tc>
@@ -6363,6 +7586,104 @@
                 <w:b w:val="0"/>
                 <w:sz w:val="18"/>
               </w:rPr>
+              <w:t>POST</w:t>
+            </w:r>
+          </w:p>
+        </w:tc>
+        <w:tc>
+          <w:tcPr>
+            <w:tcW w:type="dxa" w:w="4649"/>
+            <w:vAlign w:val="center"/>
+            <w:tcBorders>
+              <w:top w:val="single" w:sz="4" w:color="D9D9D9"/>
+              <w:left w:val="single" w:sz="4" w:color="D9D9D9"/>
+              <w:bottom w:val="single" w:sz="4" w:color="D9D9D9"/>
+              <w:right w:val="single" w:sz="4" w:color="D9D9D9"/>
+            </w:tcBorders>
+            <w:shd w:fill="FFFFFF"/>
+            <w:tcMar>
+              <w:top w:w="80" w:type="dxa"/>
+              <w:bottom w:w="80" w:type="dxa"/>
+              <w:left w:w="80" w:type="dxa"/>
+              <w:right w:w="80" w:type="dxa"/>
+            </w:tcMar>
+          </w:tcPr>
+          <w:p>
+            <w:pPr>
+              <w:spacing w:after="40" w:line="252" w:lineRule="auto"/>
+            </w:pPr>
+            <w:r>
+              <w:rPr>
+                <w:b w:val="0"/>
+                <w:sz w:val="18"/>
+              </w:rPr>
+              <w:t>/api/platform/dictionary</w:t>
+            </w:r>
+          </w:p>
+        </w:tc>
+        <w:tc>
+          <w:tcPr>
+            <w:tcW w:type="dxa" w:w="3855"/>
+            <w:vAlign w:val="center"/>
+            <w:tcBorders>
+              <w:top w:val="single" w:sz="4" w:color="D9D9D9"/>
+              <w:left w:val="single" w:sz="4" w:color="D9D9D9"/>
+              <w:bottom w:val="single" w:sz="4" w:color="D9D9D9"/>
+              <w:right w:val="single" w:sz="4" w:color="D9D9D9"/>
+            </w:tcBorders>
+            <w:shd w:fill="FFFFFF"/>
+            <w:tcMar>
+              <w:top w:w="80" w:type="dxa"/>
+              <w:bottom w:w="80" w:type="dxa"/>
+              <w:left w:w="80" w:type="dxa"/>
+              <w:right w:w="80" w:type="dxa"/>
+            </w:tcMar>
+          </w:tcPr>
+          <w:p>
+            <w:pPr>
+              <w:spacing w:after="40" w:line="252" w:lineRule="auto"/>
+            </w:pPr>
+            <w:r>
+              <w:rPr>
+                <w:b w:val="0"/>
+                <w:sz w:val="18"/>
+              </w:rPr>
+              <w:t>body: category, code, name</w:t>
+            </w:r>
+          </w:p>
+        </w:tc>
+      </w:tr>
+      <w:tr>
+        <w:trPr>
+          <w:cantSplit/>
+        </w:trPr>
+        <w:tc>
+          <w:tcPr>
+            <w:tcW w:type="dxa" w:w="1134"/>
+            <w:vAlign w:val="center"/>
+            <w:tcBorders>
+              <w:top w:val="single" w:sz="4" w:color="D9D9D9"/>
+              <w:left w:val="single" w:sz="4" w:color="D9D9D9"/>
+              <w:bottom w:val="single" w:sz="4" w:color="D9D9D9"/>
+              <w:right w:val="single" w:sz="4" w:color="D9D9D9"/>
+            </w:tcBorders>
+            <w:shd w:fill="FFFFFF"/>
+            <w:tcMar>
+              <w:top w:w="80" w:type="dxa"/>
+              <w:bottom w:w="80" w:type="dxa"/>
+              <w:left w:w="80" w:type="dxa"/>
+              <w:right w:w="80" w:type="dxa"/>
+            </w:tcMar>
+          </w:tcPr>
+          <w:p>
+            <w:pPr>
+              <w:spacing w:after="40" w:line="252" w:lineRule="auto"/>
+            </w:pPr>
+            <w:r>
+              <w:rPr>
+                <w:b w:val="0"/>
+                <w:sz w:val="18"/>
+              </w:rPr>
               <w:t>GET</w:t>
             </w:r>
           </w:p>
@@ -6426,104 +7747,6 @@
                 <w:sz w:val="18"/>
               </w:rPr>
               <w:t>无请求体或使用路径参数</w:t>
-            </w:r>
-          </w:p>
-        </w:tc>
-      </w:tr>
-      <w:tr>
-        <w:trPr>
-          <w:cantSplit/>
-        </w:trPr>
-        <w:tc>
-          <w:tcPr>
-            <w:tcW w:type="dxa" w:w="1134"/>
-            <w:vAlign w:val="center"/>
-            <w:tcBorders>
-              <w:top w:val="single" w:sz="4" w:color="D9D9D9"/>
-              <w:left w:val="single" w:sz="4" w:color="D9D9D9"/>
-              <w:bottom w:val="single" w:sz="4" w:color="D9D9D9"/>
-              <w:right w:val="single" w:sz="4" w:color="D9D9D9"/>
-            </w:tcBorders>
-            <w:shd w:fill="FFFFFF"/>
-            <w:tcMar>
-              <w:top w:w="80" w:type="dxa"/>
-              <w:bottom w:w="80" w:type="dxa"/>
-              <w:left w:w="80" w:type="dxa"/>
-              <w:right w:w="80" w:type="dxa"/>
-            </w:tcMar>
-          </w:tcPr>
-          <w:p>
-            <w:pPr>
-              <w:spacing w:after="40" w:line="252" w:lineRule="auto"/>
-            </w:pPr>
-            <w:r>
-              <w:rPr>
-                <w:b w:val="0"/>
-                <w:sz w:val="18"/>
-              </w:rPr>
-              <w:t>POST</w:t>
-            </w:r>
-          </w:p>
-        </w:tc>
-        <w:tc>
-          <w:tcPr>
-            <w:tcW w:type="dxa" w:w="4649"/>
-            <w:vAlign w:val="center"/>
-            <w:tcBorders>
-              <w:top w:val="single" w:sz="4" w:color="D9D9D9"/>
-              <w:left w:val="single" w:sz="4" w:color="D9D9D9"/>
-              <w:bottom w:val="single" w:sz="4" w:color="D9D9D9"/>
-              <w:right w:val="single" w:sz="4" w:color="D9D9D9"/>
-            </w:tcBorders>
-            <w:shd w:fill="FFFFFF"/>
-            <w:tcMar>
-              <w:top w:w="80" w:type="dxa"/>
-              <w:bottom w:w="80" w:type="dxa"/>
-              <w:left w:w="80" w:type="dxa"/>
-              <w:right w:w="80" w:type="dxa"/>
-            </w:tcMar>
-          </w:tcPr>
-          <w:p>
-            <w:pPr>
-              <w:spacing w:after="40" w:line="252" w:lineRule="auto"/>
-            </w:pPr>
-            <w:r>
-              <w:rPr>
-                <w:b w:val="0"/>
-                <w:sz w:val="18"/>
-              </w:rPr>
-              <w:t>/api/platform/dictionary</w:t>
-            </w:r>
-          </w:p>
-        </w:tc>
-        <w:tc>
-          <w:tcPr>
-            <w:tcW w:type="dxa" w:w="3855"/>
-            <w:vAlign w:val="center"/>
-            <w:tcBorders>
-              <w:top w:val="single" w:sz="4" w:color="D9D9D9"/>
-              <w:left w:val="single" w:sz="4" w:color="D9D9D9"/>
-              <w:bottom w:val="single" w:sz="4" w:color="D9D9D9"/>
-              <w:right w:val="single" w:sz="4" w:color="D9D9D9"/>
-            </w:tcBorders>
-            <w:shd w:fill="FFFFFF"/>
-            <w:tcMar>
-              <w:top w:w="80" w:type="dxa"/>
-              <w:bottom w:w="80" w:type="dxa"/>
-              <w:left w:w="80" w:type="dxa"/>
-              <w:right w:w="80" w:type="dxa"/>
-            </w:tcMar>
-          </w:tcPr>
-          <w:p>
-            <w:pPr>
-              <w:spacing w:after="40" w:line="252" w:lineRule="auto"/>
-            </w:pPr>
-            <w:r>
-              <w:rPr>
-                <w:b w:val="0"/>
-                <w:sz w:val="18"/>
-              </w:rPr>
-              <w:t>body: category, code, name</w:t>
             </w:r>
           </w:p>
         </w:tc>
@@ -7147,7 +8370,7 @@
                 <w:b w:val="0"/>
                 <w:sz w:val="18"/>
               </w:rPr>
-              <w:t>PUT</w:t>
+              <w:t>DELETE</w:t>
             </w:r>
           </w:p>
         </w:tc>
@@ -7245,7 +8468,7 @@
                 <w:b w:val="0"/>
                 <w:sz w:val="18"/>
               </w:rPr>
-              <w:t>DELETE</w:t>
+              <w:t>PUT</w:t>
             </w:r>
           </w:p>
         </w:tc>
@@ -8423,7 +9646,7 @@
                 <w:b w:val="0"/>
                 <w:sz w:val="18"/>
               </w:rPr>
-              <w:t>PUT</w:t>
+              <w:t>DELETE</w:t>
             </w:r>
           </w:p>
         </w:tc>
@@ -8521,7 +9744,7 @@
                 <w:b w:val="0"/>
                 <w:sz w:val="18"/>
               </w:rPr>
-              <w:t>DELETE</w:t>
+              <w:t>PUT</w:t>
             </w:r>
           </w:p>
         </w:tc>

</xml_diff>